<commit_message>
Add repository link to the report conclusion
</commit_message>
<xml_diff>
--- a/docs/Layers_Report.docx
+++ b/docs/Layers_Report.docx
@@ -1185,6 +1185,15 @@
         <w:t>Кодова база розкладена за схемою CLI / Core / Infra: команди говорять з презентерами і сторами через інтерфейси, світи тримають стан, маппери - міст до DTO, домен Core не знає ні про консоль, ні про файли. Кожна частина замінна окремо: дисплей, формат сейвів, команди. Стан гри і тексту серіалізується в JSON і відновлюється командами save/load; сценарії використання лежать у demo/.</w:t>
       </w:r>
     </w:p>
+    <w:p>
+      <w:r>
+        <w:rPr>
+          <w:rFonts w:ascii="Times New Roman" w:hAnsi="Times New Roman"/>
+          <w:b w:val="0"/>
+        </w:rPr>
+        <w:t>Репозиторій з кодом: https://github.com/mvockob/Layers-ProjectOOP</w:t>
+      </w:r>
+    </w:p>
     <w:sectPr>
       <w:pgSz w:w="11906" w:h="16838"/>
       <w:pgMar w:top="1134" w:right="1134" w:bottom="1134" w:left="1134" w:header="720" w:footer="720" w:gutter="0"/>

</xml_diff>

<commit_message>
Add tests figure, README tests section, CI unit tests, report Tests updates
</commit_message>
<xml_diff>
--- a/docs/Layers_Report.docx
+++ b/docs/Layers_Report.docx
@@ -338,6 +338,50 @@
           </w:p>
         </w:tc>
       </w:tr>
+      <w:tr>
+        <w:tc>
+          <w:tcPr>
+            <w:tcW w:type="dxa" w:w="1587"/>
+          </w:tcPr>
+          <w:p>
+            <w:r>
+              <w:rPr>
+                <w:rFonts w:ascii="Times New Roman" w:hAnsi="Times New Roman"/>
+                <w:sz w:val="28"/>
+              </w:rPr>
+              <w:t>src/Tests.*/</w:t>
+            </w:r>
+          </w:p>
+        </w:tc>
+        <w:tc>
+          <w:tcPr>
+            <w:tcW w:type="dxa" w:w="1247"/>
+          </w:tcPr>
+          <w:p>
+            <w:r>
+              <w:rPr>
+                <w:rFonts w:ascii="Times New Roman" w:hAnsi="Times New Roman"/>
+                <w:sz w:val="28"/>
+              </w:rPr>
+              <w:t>Tests</w:t>
+            </w:r>
+          </w:p>
+        </w:tc>
+        <w:tc>
+          <w:tcPr>
+            <w:tcW w:type="dxa" w:w="6803"/>
+          </w:tcPr>
+          <w:p>
+            <w:r>
+              <w:rPr>
+                <w:rFonts w:ascii="Times New Roman" w:hAnsi="Times New Roman"/>
+                <w:sz w:val="28"/>
+              </w:rPr>
+              <w:t>Tests.Core (39 тестів домену), Tests.Infra (7 тестів сховищ), Tests.Cli (66 тестів: парсер, команди, навігація). Запуск: dotnet test Layers.sln.</w:t>
+            </w:r>
+          </w:p>
+        </w:tc>
+      </w:tr>
     </w:tbl>
     <w:p>
       <w:pPr>
@@ -523,6 +567,58 @@
           <w:sz w:val="24"/>
         </w:rPr>
         <w:t>Фігура 3. Домени Core: персонажі і текст.</w:t>
+      </w:r>
+    </w:p>
+    <w:p>
+      <w:pPr>
+        <w:jc w:val="center"/>
+      </w:pPr>
+      <w:r>
+        <w:drawing>
+          <wp:inline xmlns:a="http://schemas.openxmlformats.org/drawingml/2006/main" xmlns:pic="http://schemas.openxmlformats.org/drawingml/2006/picture">
+            <wp:extent cx="8640000" cy="856319"/>
+            <wp:docPr id="4" name="Picture 4"/>
+            <wp:cNvGraphicFramePr>
+              <a:graphicFrameLocks noChangeAspect="1"/>
+            </wp:cNvGraphicFramePr>
+            <a:graphic>
+              <a:graphicData uri="http://schemas.openxmlformats.org/drawingml/2006/picture">
+                <pic:pic>
+                  <pic:nvPicPr>
+                    <pic:cNvPr id="0" name="diagram-tests.png"/>
+                    <pic:cNvPicPr/>
+                  </pic:nvPicPr>
+                  <pic:blipFill>
+                    <a:blip r:embed="rId12"/>
+                    <a:stretch>
+                      <a:fillRect/>
+                    </a:stretch>
+                  </pic:blipFill>
+                  <pic:spPr>
+                    <a:xfrm>
+                      <a:off x="0" y="0"/>
+                      <a:ext cx="5760000" cy="570879"/>
+                    </a:xfrm>
+                    <a:prstGeom prst="rect"/>
+                  </pic:spPr>
+                </pic:pic>
+              </a:graphicData>
+            </a:graphic>
+          </wp:inline>
+        </w:drawing>
+      </w:r>
+    </w:p>
+    <w:p>
+      <w:pPr>
+        <w:jc w:val="center"/>
+      </w:pPr>
+      <w:r>
+        <w:rPr>
+          <w:rFonts w:ascii="Times New Roman" w:hAnsi="Times New Roman"/>
+          <w:i/>
+          <w:sz w:val="24"/>
+        </w:rPr>
+        <w:t>Фігура 4. Тести: по проєкту на шар, фейки замість моків.</w:t>
       </w:r>
     </w:p>
     <w:p>
@@ -1167,6 +1263,28 @@
     </w:p>
     <w:p>
       <w:pPr>
+        <w:pStyle w:val="ListBullet"/>
+      </w:pPr>
+      <w:r>
+        <w:rPr>
+          <w:rFonts w:ascii="Times New Roman" w:hAnsi="Times New Roman"/>
+        </w:rPr>
+        <w:t>112 xUnit-тестів: Tests.Core (39) - доменна логіка, Tests.Infra (7) - JSON-сховища на тимчасових файлах, Tests.Cli (66) - парсер, реєстри, команди, навігація, маппери, REPL. Запуск: dotnet test Layers.sln.</w:t>
+      </w:r>
+    </w:p>
+    <w:p>
+      <w:pPr>
+        <w:pStyle w:val="ListBullet"/>
+      </w:pPr>
+      <w:r>
+        <w:rPr>
+          <w:rFonts w:ascii="Times New Roman" w:hAnsi="Times New Roman"/>
+        </w:rPr>
+        <w:t>Замість моків - ручний FakeDisplay: черга вводу і захоплений вивід без зайвих залежностей; сховища тестуються на тимчасових файлах.</w:t>
+      </w:r>
+    </w:p>
+    <w:p>
+      <w:pPr>
         <w:pStyle w:val="Heading1"/>
       </w:pPr>
       <w:r>

</xml_diff>

<commit_message>
Embed test run screenshot in report, update repo link to Markentyy
</commit_message>
<xml_diff>
--- a/docs/Layers_Report.docx
+++ b/docs/Layers_Report.docx
@@ -1285,6 +1285,58 @@
     </w:p>
     <w:p>
       <w:pPr>
+        <w:jc w:val="center"/>
+      </w:pPr>
+      <w:r>
+        <w:drawing>
+          <wp:inline xmlns:a="http://schemas.openxmlformats.org/drawingml/2006/main" xmlns:pic="http://schemas.openxmlformats.org/drawingml/2006/picture">
+            <wp:extent cx="5400000" cy="4294588"/>
+            <wp:docPr id="5" name="Picture 5"/>
+            <wp:cNvGraphicFramePr>
+              <a:graphicFrameLocks noChangeAspect="1"/>
+            </wp:cNvGraphicFramePr>
+            <a:graphic>
+              <a:graphicData uri="http://schemas.openxmlformats.org/drawingml/2006/picture">
+                <pic:pic>
+                  <pic:nvPicPr>
+                    <pic:cNvPr id="0" name="test-summary.png"/>
+                    <pic:cNvPicPr/>
+                  </pic:nvPicPr>
+                  <pic:blipFill>
+                    <a:blip r:embed="rId13"/>
+                    <a:stretch>
+                      <a:fillRect/>
+                    </a:stretch>
+                  </pic:blipFill>
+                  <pic:spPr>
+                    <a:xfrm>
+                      <a:off x="0" y="0"/>
+                      <a:ext cx="5400000" cy="4294588"/>
+                    </a:xfrm>
+                    <a:prstGeom prst="rect"/>
+                  </pic:spPr>
+                </pic:pic>
+              </a:graphicData>
+            </a:graphic>
+          </wp:inline>
+        </w:drawing>
+      </w:r>
+    </w:p>
+    <w:p>
+      <w:pPr>
+        <w:jc w:val="center"/>
+      </w:pPr>
+      <w:r>
+        <w:rPr>
+          <w:rFonts w:ascii="Times New Roman" w:hAnsi="Times New Roman"/>
+          <w:i/>
+          <w:sz w:val="24"/>
+        </w:rPr>
+        <w:t>Скріншот. Підсумок прогону тестів: 39 + 7 + 66 Passed.</w:t>
+      </w:r>
+    </w:p>
+    <w:p>
+      <w:pPr>
         <w:pStyle w:val="Heading1"/>
       </w:pPr>
       <w:r>
@@ -1309,7 +1361,7 @@
           <w:rFonts w:ascii="Times New Roman" w:hAnsi="Times New Roman"/>
           <w:b w:val="0"/>
         </w:rPr>
-        <w:t>Репозиторій з кодом: https://github.com/mvockob/Layers-ProjectOOP</w:t>
+        <w:t>Репозиторій з кодом: https://github.com/Markentyy/Layers-ProjectOOP</w:t>
       </w:r>
     </w:p>
     <w:sectPr>

</xml_diff>

<commit_message>
Document WebApi: README section, infra diagram figure, report updates
</commit_message>
<xml_diff>
--- a/docs/Layers_Report.docx
+++ b/docs/Layers_Report.docx
@@ -246,6 +246,9 @@
                 <w:sz w:val="28"/>
               </w:rPr>
               <w:t>Display: IDisplay, ConsoleDisplay. Data: DTO-снапшоти, ICharsStore/ITextStore, JsonCharsStore/JsonTextStore. Залежить лише від Core.</w:t>
+            </w:r>
+            <w:r>
+              <w:t xml:space="preserve"> WebApi: IGenshinApiClient, GenshinApiClient, DTO, WebApiException.</w:t>
             </w:r>
           </w:p>
         </w:tc>
@@ -524,6 +527,58 @@
       <w:r>
         <w:drawing>
           <wp:inline xmlns:a="http://schemas.openxmlformats.org/drawingml/2006/main" xmlns:pic="http://schemas.openxmlformats.org/drawingml/2006/picture">
+            <wp:extent cx="5760000" cy="1171973"/>
+            <wp:docPr id="6" name="Picture 6"/>
+            <wp:cNvGraphicFramePr>
+              <a:graphicFrameLocks noChangeAspect="1"/>
+            </wp:cNvGraphicFramePr>
+            <a:graphic>
+              <a:graphicData uri="http://schemas.openxmlformats.org/drawingml/2006/picture">
+                <pic:pic>
+                  <pic:nvPicPr>
+                    <pic:cNvPr id="0" name="diagram-infra.png"/>
+                    <pic:cNvPicPr/>
+                  </pic:nvPicPr>
+                  <pic:blipFill>
+                    <a:blip r:embed="rId14"/>
+                    <a:stretch>
+                      <a:fillRect/>
+                    </a:stretch>
+                  </pic:blipFill>
+                  <pic:spPr>
+                    <a:xfrm>
+                      <a:off x="0" y="0"/>
+                      <a:ext cx="5760000" cy="1171973"/>
+                    </a:xfrm>
+                    <a:prstGeom prst="rect"/>
+                  </pic:spPr>
+                </pic:pic>
+              </a:graphicData>
+            </a:graphic>
+          </wp:inline>
+        </w:drawing>
+      </w:r>
+    </w:p>
+    <w:p>
+      <w:pPr>
+        <w:jc w:val="center"/>
+      </w:pPr>
+      <w:r>
+        <w:rPr>
+          <w:rFonts w:ascii="Times New Roman" w:hAnsi="Times New Roman"/>
+          <w:i/>
+          <w:sz w:val="24"/>
+        </w:rPr>
+        <w:t>Фігура 3. Інфра: дисплей, файлові сховища, WebApi-клієнт.</w:t>
+      </w:r>
+    </w:p>
+    <w:p>
+      <w:pPr>
+        <w:jc w:val="center"/>
+      </w:pPr>
+      <w:r>
+        <w:drawing>
+          <wp:inline xmlns:a="http://schemas.openxmlformats.org/drawingml/2006/main" xmlns:pic="http://schemas.openxmlformats.org/drawingml/2006/picture">
             <wp:extent cx="8640000" cy="2114601"/>
             <wp:docPr id="3" name="Picture 3"/>
             <wp:cNvGraphicFramePr>
@@ -566,7 +621,7 @@
           <w:i/>
           <w:sz w:val="24"/>
         </w:rPr>
-        <w:t>Фігура 3. Домени Core: персонажі і текст.</w:t>
+        <w:t>Фігура 4. Домени Core: персонажі і текст.</w:t>
       </w:r>
     </w:p>
     <w:p>
@@ -618,7 +673,7 @@
           <w:i/>
           <w:sz w:val="24"/>
         </w:rPr>
-        <w:t>Фігура 4. Тести: по проєкту на шар, фейки замість моків.</w:t>
+        <w:t>Фігура 5. Тести: по проєкту на шар, фейки замість моків.</w:t>
       </w:r>
     </w:p>
     <w:p>
@@ -1053,6 +1108,94 @@
           </w:p>
         </w:tc>
       </w:tr>
+      <w:tr>
+        <w:tc>
+          <w:tcPr>
+            <w:tcW w:type="dxa" w:w="3213"/>
+          </w:tcPr>
+          <w:p>
+            <w:r>
+              <w:rPr>
+                <w:rFonts w:ascii="Times New Roman" w:hAnsi="Times New Roman"/>
+                <w:sz w:val="28"/>
+              </w:rPr>
+              <w:t>IGenshinApiClient / GenshinApiClient</w:t>
+            </w:r>
+          </w:p>
+        </w:tc>
+        <w:tc>
+          <w:tcPr>
+            <w:tcW w:type="dxa" w:w="3213"/>
+          </w:tcPr>
+          <w:p>
+            <w:r>
+              <w:rPr>
+                <w:rFonts w:ascii="Times New Roman" w:hAnsi="Times New Roman"/>
+                <w:sz w:val="28"/>
+              </w:rPr>
+              <w:t>Infra. Читання віддаленої бази по HTTP.</w:t>
+            </w:r>
+          </w:p>
+        </w:tc>
+        <w:tc>
+          <w:tcPr>
+            <w:tcW w:type="dxa" w:w="3213"/>
+          </w:tcPr>
+          <w:p>
+            <w:r>
+              <w:rPr>
+                <w:rFonts w:ascii="Times New Roman" w:hAnsi="Times New Roman"/>
+                <w:sz w:val="28"/>
+              </w:rPr>
+              <w:t>Команди db/recruit/fetch; тести підміняють фейком.</w:t>
+            </w:r>
+          </w:p>
+        </w:tc>
+      </w:tr>
+      <w:tr>
+        <w:tc>
+          <w:tcPr>
+            <w:tcW w:type="dxa" w:w="3213"/>
+          </w:tcPr>
+          <w:p>
+            <w:r>
+              <w:rPr>
+                <w:rFonts w:ascii="Times New Roman" w:hAnsi="Times New Roman"/>
+                <w:sz w:val="28"/>
+              </w:rPr>
+              <w:t>GenshinMapper / CharacterSheet</w:t>
+            </w:r>
+          </w:p>
+        </w:tc>
+        <w:tc>
+          <w:tcPr>
+            <w:tcW w:type="dxa" w:w="3213"/>
+          </w:tcPr>
+          <w:p>
+            <w:r>
+              <w:rPr>
+                <w:rFonts w:ascii="Times New Roman" w:hAnsi="Times New Roman"/>
+                <w:sz w:val="28"/>
+              </w:rPr>
+              <w:t>Переклад лору в домен і лист персонажа текстом.</w:t>
+            </w:r>
+          </w:p>
+        </w:tc>
+        <w:tc>
+          <w:tcPr>
+            <w:tcW w:type="dxa" w:w="3213"/>
+          </w:tcPr>
+          <w:p>
+            <w:r>
+              <w:rPr>
+                <w:rFonts w:ascii="Times New Roman" w:hAnsi="Times New Roman"/>
+                <w:sz w:val="28"/>
+              </w:rPr>
+              <w:t>Кидання статів за рідкістю; show друкує лист.</w:t>
+            </w:r>
+          </w:p>
+        </w:tc>
+      </w:tr>
     </w:tbl>
     <w:p>
       <w:pPr>
@@ -1343,7 +1486,62 @@
         <w:rPr>
           <w:rFonts w:ascii="Times New Roman" w:hAnsi="Times New Roman"/>
         </w:rPr>
-        <w:t>8. Висновок</w:t>
+        <w:t>8. WebApi: віддалена база</w:t>
+      </w:r>
+    </w:p>
+    <w:p>
+      <w:pPr>
+        <w:pStyle w:val="ListBullet"/>
+      </w:pPr>
+      <w:r>
+        <w:rPr>
+          <w:rFonts w:ascii="Times New Roman" w:hAnsi="Times New Roman"/>
+        </w:rPr>
+        <w:t>Обрано рекомендований простий інтерфейс https://genshin.jmp.blue (JSON, без авторизації, HttpClient зі стандартної бібліотеки).</w:t>
+      </w:r>
+    </w:p>
+    <w:p>
+      <w:pPr>
+        <w:pStyle w:val="ListBullet"/>
+      </w:pPr>
+      <w:r>
+        <w:rPr>
+          <w:rFonts w:ascii="Times New Roman" w:hAnsi="Times New Roman"/>
+        </w:rPr>
+        <w:t>Персонажі несуть лише лор: характеристики генеруються за рідкістю (5 зірок: HP 90-120, ATK 20-30, ARM 3-6; 4 зірки: HP 60-90, ATK 12-20, ARM 1-4).</w:t>
+      </w:r>
+    </w:p>
+    <w:p>
+      <w:pPr>
+        <w:pStyle w:val="ListBullet"/>
+      </w:pPr>
+      <w:r>
+        <w:rPr>
+          <w:rFonts w:ascii="Times New Roman" w:hAnsi="Times New Roman"/>
+        </w:rPr>
+        <w:t>Таланти стають здібностями (burst - x3, skill - x2, решта - x1); зброя має власні стати (атака - baseAttack/10, броня - рідкість).</w:t>
+      </w:r>
+    </w:p>
+    <w:p>
+      <w:pPr>
+        <w:pStyle w:val="ListBullet"/>
+      </w:pPr>
+      <w:r>
+        <w:rPr>
+          <w:rFonts w:ascii="Times New Roman" w:hAnsi="Times New Roman"/>
+        </w:rPr>
+        <w:t>Команди db (список з пошуком і лімітом), recruit (вербовка з талантами), fetch (імпорт зброї), show (лист персонажа структурованим текстом).</w:t>
+      </w:r>
+    </w:p>
+    <w:p>
+      <w:pPr>
+        <w:pStyle w:val="Heading1"/>
+      </w:pPr>
+      <w:r>
+        <w:rPr>
+          <w:rFonts w:ascii="Times New Roman" w:hAnsi="Times New Roman"/>
+        </w:rPr>
+        <w:t>9. Висновок</w:t>
       </w:r>
     </w:p>
     <w:p>

</xml_diff>

<commit_message>
Refresh report numbers and test screenshot for WebApi state
</commit_message>
<xml_diff>
--- a/docs/Layers_Report.docx
+++ b/docs/Layers_Report.docx
@@ -1366,11 +1366,12 @@
       <w:pPr>
         <w:pStyle w:val="ListBullet"/>
       </w:pPr>
+      <w:r/>
       <w:r>
         <w:rPr>
           <w:rFonts w:ascii="Times New Roman" w:hAnsi="Times New Roman"/>
         </w:rPr>
-        <w:t>Чотири демо-сценарії: команди обох режимів і раундтріп сейвів; ключові рядки перевіряє CI.</w:t>
+        <w:t>П'ять демо-сценаріїв: команди обох режимів, раундтріп сейвів і вербовка з бази; ключові рядки перевіряє CI.</w:t>
       </w:r>
     </w:p>
     <w:p>
@@ -1408,11 +1409,12 @@
       <w:pPr>
         <w:pStyle w:val="ListBullet"/>
       </w:pPr>
+      <w:r/>
       <w:r>
         <w:rPr>
           <w:rFonts w:ascii="Times New Roman" w:hAnsi="Times New Roman"/>
         </w:rPr>
-        <w:t>112 xUnit-тестів: Tests.Core (39) - доменна логіка, Tests.Infra (7) - JSON-сховища на тимчасових файлах, Tests.Cli (66) - парсер, реєстри, команди, навігація, маппери, REPL. Запуск: dotnet test Layers.sln.</w:t>
+        <w:t>140 xUnit-тестів: Tests.Core (39) - доменна логіка, Tests.Infra (14) - JSON-сховища і WebApi-клієнт, Tests.Cli (87) - парсер, реєстри, команди, навігація, маппери, лист, REPL. Запуск: dotnet test Layers.sln.</w:t>
       </w:r>
     </w:p>
     <w:p>
@@ -1469,13 +1471,14 @@
       <w:pPr>
         <w:jc w:val="center"/>
       </w:pPr>
+      <w:r/>
       <w:r>
         <w:rPr>
           <w:rFonts w:ascii="Times New Roman" w:hAnsi="Times New Roman"/>
           <w:i/>
           <w:sz w:val="24"/>
         </w:rPr>
-        <w:t>Скріншот. Підсумок прогону тестів: 39 + 7 + 66 Passed.</w:t>
+        <w:t>Скріншот. Підсумок прогону тестів: 39 + 14 + 87 Passed.</w:t>
       </w:r>
     </w:p>
     <w:p>

</xml_diff>

<commit_message>
Finalize WebApi report: TZ mapping, e2e sample, test screenshot
</commit_message>
<xml_diff>
--- a/docs/Layers_Report.docx
+++ b/docs/Layers_Report.docx
@@ -31,12 +31,12 @@
       </w:r>
     </w:p>
     <w:p>
+      <w:r/>
       <w:r>
         <w:rPr>
           <w:rFonts w:ascii="Times New Roman" w:hAnsi="Times New Roman"/>
-          <w:b w:val="0"/>
         </w:rPr>
-        <w:t>Дата: 27.09.2026</w:t>
+        <w:t>Дата: 04.10.2026</w:t>
       </w:r>
     </w:p>
     <w:p>
@@ -54,42 +54,45 @@
       <w:pPr>
         <w:pStyle w:val="ListBullet"/>
       </w:pPr>
+      <w:r/>
       <w:r>
         <w:rPr>
           <w:rFonts w:ascii="Times New Roman" w:hAnsi="Times New Roman"/>
         </w:rPr>
-        <w:t>Перекласти кодову базу на проєктну структуру CLI / Core / Infra або її еквівалент.</w:t>
+        <w:t>Додати до інфраструктури модуль WebApi для запитів до віддаленого сервісу (http-клієнт зі стандартної бібліотеки) і стягування інформації про персонажів.</w:t>
       </w:r>
     </w:p>
     <w:p>
       <w:pPr>
         <w:pStyle w:val="ListBullet"/>
       </w:pPr>
+      <w:r/>
       <w:r>
         <w:rPr>
           <w:rFonts w:ascii="Times New Roman" w:hAnsi="Times New Roman"/>
         </w:rPr>
-        <w:t>Для кожної частини розробити свої моделі, класи, налагодити модульність і замінність частин; за потреби - рефакторинг.</w:t>
+        <w:t>Стягнуту інформацію транслювати на внутрішні класи персонажів, написати представлення персонажа засобами структурованого тексту.</w:t>
       </w:r>
     </w:p>
     <w:p>
       <w:pPr>
         <w:pStyle w:val="ListBullet"/>
       </w:pPr>
+      <w:r/>
       <w:r>
         <w:rPr>
           <w:rFonts w:ascii="Times New Roman" w:hAnsi="Times New Roman"/>
         </w:rPr>
-        <w:t>Додати файли зі сценаріями використання програми.</w:t>
+        <w:t>Додати команди списку персонажів і зброї з бази, створення віртуального персонажа і екіпіровки предмета; результат - вивід стану персонажа в консоль. Код покрити тестами, надіслати скриншот і архів.</w:t>
       </w:r>
     </w:p>
     <w:p>
+      <w:r/>
       <w:r>
         <w:rPr>
           <w:rFonts w:ascii="Times New Roman" w:hAnsi="Times New Roman"/>
-          <w:b w:val="0"/>
         </w:rPr>
-        <w:t>Схема шарів: CLI - Commands (термінальні команди) і Presenter (ввід/вивід); Core - Text (структурований текст) і Characters (персонажі); Infra - Display (абстракція консолі) і Data (серіалізація стану для відновлення).</w:t>
+        <w:t>База: рекомендований Genshin API https://genshin.jmp.blue (JSON). Схема шарів без змін: CLI - Commands і Presenter; Core - Text і Characters; Infra - Display, Data і новий WebApi; Tests - Core, Infra, CLI.</w:t>
       </w:r>
     </w:p>
     <w:p>
@@ -1435,7 +1438,7 @@
       <w:r>
         <w:drawing>
           <wp:inline xmlns:a="http://schemas.openxmlformats.org/drawingml/2006/main" xmlns:pic="http://schemas.openxmlformats.org/drawingml/2006/picture">
-            <wp:extent cx="5400000" cy="4294588"/>
+            <wp:extent cx="4320000" cy="559152"/>
             <wp:docPr id="5" name="Picture 5"/>
             <wp:cNvGraphicFramePr>
               <a:graphicFrameLocks noChangeAspect="1"/>
@@ -1536,6 +1539,427 @@
         <w:t>Команди db (список з пошуком і лімітом), recruit (вербовка з талантами), fetch (імпорт зброї), show (лист персонажа структурованим текстом).</w:t>
       </w:r>
     </w:p>
+    <w:p>
+      <w:pPr>
+        <w:pStyle w:val="ListBullet"/>
+      </w:pPr>
+      <w:r>
+        <w:rPr>
+          <w:rFonts w:ascii="Times New Roman" w:hAnsi="Times New Roman"/>
+        </w:rPr>
+        <w:t>Наскрізний ланцюжок за ТЗ з реального прогону: вербовка з бази, імпорт зброї, екіпіровка, лист персонажа.</w:t>
+      </w:r>
+    </w:p>
+    <w:p>
+      <w:r>
+        <w:rPr>
+          <w:rFonts w:ascii="Courier New" w:hAnsi="Courier New"/>
+          <w:sz w:val="21"/>
+        </w:rPr>
+        <w:t>&gt; recruit klee</w:t>
+        <w:br/>
+        <w:t>Recruited 'Klee' [klee] (94 HP, 6 ARM, 28 ATK, 3 talents learned).</w:t>
+        <w:br/>
+        <w:t>&gt; fetch skyward-blade</w:t>
+        <w:br/>
+        <w:t>Fetched 'Skyward Blade' [skyward-blade] (+4 ATK, +5 ARM).</w:t>
+        <w:br/>
+        <w:t>&gt; add --char_id klee --id skyward-blade</w:t>
+        <w:br/>
+        <w:t>Klee equipped Skyward Blade (+4 ATK, +5 ARM).</w:t>
+        <w:br/>
+        <w:t>&gt; show klee</w:t>
+        <w:br/>
+        <w:br/>
+        <w:t># klee</w:t>
+        <w:br/>
+        <w:br/>
+        <w:t># Klee</w:t>
+        <w:br/>
+        <w:t>[klee] 94/94 HP, 32 ATK, 11 ARM. Fleeing Sunlight, Pyro, Mondstadt, 5 stars.</w:t>
+        <w:br/>
+        <w:t>An explosives expert and a regular at the Knights of Favonius' confinement room. Also known as Fleeing Sunlight.</w:t>
+        <w:br/>
+        <w:br/>
+        <w:t># talents</w:t>
+        <w:br/>
+        <w:br/>
+        <w:t>## Talents</w:t>
+        <w:br/>
+        <w:br/>
+        <w:t>## Kaboom!</w:t>
+        <w:br/>
+        <w:t>Normal Attack. Normal Attack</w:t>
+        <w:br/>
+        <w:t>Throws things that go boom when they hit things! Perform up to 3 explosive attacks, dealing AoE Pyro DMG.</w:t>
+        <w:br/>
+        <w:t>Charged Attack</w:t>
+        <w:br/>
+        <w:t>Consumes a certain amount of Stamina and deals Pyro DMG to enemies after a short casting time.</w:t>
+        <w:br/>
+        <w:t>Plunging Attack</w:t>
+        <w:br/>
+        <w:t>Gathering the power of Pyro, Klee plunges towards the  ...</w:t>
+        <w:br/>
+        <w:br/>
+        <w:t>## Jumpy Dumpty</w:t>
+        <w:br/>
+        <w:t>Elemental Skill. Jumpy Dumpty is tons of boom-bang-fun!</w:t>
+        <w:br/>
+        <w:br/>
+        <w:t>When thrown, Jumpy Dumpty bounces thrice, igniting and dealing AoE Pyro DMG with every bounce.</w:t>
+        <w:br/>
+        <w:t>On the third bounce, the bomb splits into many mines.</w:t>
+        <w:br/>
+        <w:br/>
+        <w:t>The mines will explode upon contact with enemies, or after a short period of time, dealing AoE Pyro DMG.</w:t>
+        <w:br/>
+        <w:t>Start ...</w:t>
+        <w:br/>
+        <w:br/>
+        <w:t>## Sparks 'n' Splash</w:t>
+        <w:br/>
+        <w:t>Elemental Burst. Klee's Blazing Delight! For the duration of this ability, continuously summons Sparks 'n' Splash to attack nearby enemies, dealing AoE Pyro DMG.</w:t>
+        <w:br/>
+        <w:br/>
+        <w:t># gear</w:t>
+        <w:br/>
+        <w:br/>
+        <w:t>## Gear</w:t>
+        <w:br/>
+        <w:t>Skyward Blade [skyward-blade] (+4 ATK, +5 ARM)</w:t>
+        <w:br/>
+        <w:t>Kaboom! [klee-t1] (x1)</w:t>
+        <w:br/>
+        <w:t>Jumpy Dumpty [klee-t2] (x2)</w:t>
+        <w:br/>
+        <w:t>Sparks 'n' Splash [klee-t3] (x3)</w:t>
+      </w:r>
+    </w:p>
+    <w:tbl>
+      <w:tblPr>
+        <w:tblStyle w:val="TableGrid"/>
+        <w:tblW w:type="auto" w:w="0"/>
+        <w:tblLayout w:type="fixed"/>
+        <w:tblLook w:firstColumn="1" w:firstRow="1" w:lastColumn="0" w:lastRow="0" w:noHBand="0" w:noVBand="1" w:val="04A0"/>
+      </w:tblPr>
+      <w:tblGrid>
+        <w:gridCol w:w="3213"/>
+        <w:gridCol w:w="3213"/>
+        <w:gridCol w:w="3213"/>
+      </w:tblGrid>
+      <w:tr>
+        <w:tc>
+          <w:tcPr>
+            <w:tcW w:type="dxa" w:w="3213"/>
+          </w:tcPr>
+          <w:p>
+            <w:r>
+              <w:rPr>
+                <w:rFonts w:ascii="Times New Roman" w:hAnsi="Times New Roman"/>
+                <w:b/>
+                <w:sz w:val="28"/>
+              </w:rPr>
+              <w:t>Пункт ТЗ</w:t>
+            </w:r>
+          </w:p>
+        </w:tc>
+        <w:tc>
+          <w:tcPr>
+            <w:tcW w:type="dxa" w:w="3213"/>
+          </w:tcPr>
+          <w:p>
+            <w:r>
+              <w:rPr>
+                <w:rFonts w:ascii="Times New Roman" w:hAnsi="Times New Roman"/>
+                <w:b/>
+                <w:sz w:val="28"/>
+              </w:rPr>
+              <w:t>Реалізація</w:t>
+            </w:r>
+          </w:p>
+        </w:tc>
+        <w:tc>
+          <w:tcPr>
+            <w:tcW w:type="dxa" w:w="3213"/>
+          </w:tcPr>
+          <w:p>
+            <w:r>
+              <w:rPr>
+                <w:rFonts w:ascii="Times New Roman" w:hAnsi="Times New Roman"/>
+                <w:b/>
+                <w:sz w:val="28"/>
+              </w:rPr>
+              <w:t>Де дивитись</w:t>
+            </w:r>
+          </w:p>
+        </w:tc>
+      </w:tr>
+      <w:tr>
+        <w:tc>
+          <w:tcPr>
+            <w:tcW w:type="dxa" w:w="3213"/>
+          </w:tcPr>
+          <w:p>
+            <w:r>
+              <w:rPr>
+                <w:rFonts w:ascii="Times New Roman" w:hAnsi="Times New Roman"/>
+                <w:sz w:val="28"/>
+              </w:rPr>
+              <w:t>WebApi-модуль на http-клієнті</w:t>
+            </w:r>
+          </w:p>
+        </w:tc>
+        <w:tc>
+          <w:tcPr>
+            <w:tcW w:type="dxa" w:w="3213"/>
+          </w:tcPr>
+          <w:p>
+            <w:r>
+              <w:rPr>
+                <w:rFonts w:ascii="Times New Roman" w:hAnsi="Times New Roman"/>
+                <w:sz w:val="28"/>
+              </w:rPr>
+              <w:t>IGenshinApiClient / GenshinApiClient, DTO, WebApiException</w:t>
+            </w:r>
+          </w:p>
+        </w:tc>
+        <w:tc>
+          <w:tcPr>
+            <w:tcW w:type="dxa" w:w="3213"/>
+          </w:tcPr>
+          <w:p>
+            <w:r>
+              <w:rPr>
+                <w:rFonts w:ascii="Times New Roman" w:hAnsi="Times New Roman"/>
+                <w:sz w:val="28"/>
+              </w:rPr>
+              <w:t>src/Infra/WebApi/</w:t>
+            </w:r>
+          </w:p>
+        </w:tc>
+      </w:tr>
+      <w:tr>
+        <w:tc>
+          <w:tcPr>
+            <w:tcW w:type="dxa" w:w="3213"/>
+          </w:tcPr>
+          <w:p>
+            <w:r>
+              <w:rPr>
+                <w:rFonts w:ascii="Times New Roman" w:hAnsi="Times New Roman"/>
+                <w:sz w:val="28"/>
+              </w:rPr>
+              <w:t>Маппінг на класи персонажів</w:t>
+            </w:r>
+          </w:p>
+        </w:tc>
+        <w:tc>
+          <w:tcPr>
+            <w:tcW w:type="dxa" w:w="3213"/>
+          </w:tcPr>
+          <w:p>
+            <w:r>
+              <w:rPr>
+                <w:rFonts w:ascii="Times New Roman" w:hAnsi="Times New Roman"/>
+                <w:sz w:val="28"/>
+              </w:rPr>
+              <w:t>GenshinMapper: таланти в здібності, зброя в предмет, статы за рідкістю</w:t>
+            </w:r>
+          </w:p>
+        </w:tc>
+        <w:tc>
+          <w:tcPr>
+            <w:tcW w:type="dxa" w:w="3213"/>
+          </w:tcPr>
+          <w:p>
+            <w:r>
+              <w:rPr>
+                <w:rFonts w:ascii="Times New Roman" w:hAnsi="Times New Roman"/>
+                <w:sz w:val="28"/>
+              </w:rPr>
+              <w:t>src/Cli/Chars/GenshinMapper.cs</w:t>
+            </w:r>
+          </w:p>
+        </w:tc>
+      </w:tr>
+      <w:tr>
+        <w:tc>
+          <w:tcPr>
+            <w:tcW w:type="dxa" w:w="3213"/>
+          </w:tcPr>
+          <w:p>
+            <w:r>
+              <w:rPr>
+                <w:rFonts w:ascii="Times New Roman" w:hAnsi="Times New Roman"/>
+                <w:sz w:val="28"/>
+              </w:rPr>
+              <w:t>Лист персонажа текстом</w:t>
+            </w:r>
+          </w:p>
+        </w:tc>
+        <w:tc>
+          <w:tcPr>
+            <w:tcW w:type="dxa" w:w="3213"/>
+          </w:tcPr>
+          <w:p>
+            <w:r>
+              <w:rPr>
+                <w:rFonts w:ascii="Times New Roman" w:hAnsi="Times New Roman"/>
+                <w:sz w:val="28"/>
+              </w:rPr>
+              <w:t>CharacterSheet: Section-документ (заголовок, опис, таланти, спорядження)</w:t>
+            </w:r>
+          </w:p>
+        </w:tc>
+        <w:tc>
+          <w:tcPr>
+            <w:tcW w:type="dxa" w:w="3213"/>
+          </w:tcPr>
+          <w:p>
+            <w:r>
+              <w:rPr>
+                <w:rFonts w:ascii="Times New Roman" w:hAnsi="Times New Roman"/>
+                <w:sz w:val="28"/>
+              </w:rPr>
+              <w:t>src/Cli/Text/CharacterSheet.cs, команда show</w:t>
+            </w:r>
+          </w:p>
+        </w:tc>
+      </w:tr>
+      <w:tr>
+        <w:tc>
+          <w:tcPr>
+            <w:tcW w:type="dxa" w:w="3213"/>
+          </w:tcPr>
+          <w:p>
+            <w:r>
+              <w:rPr>
+                <w:rFonts w:ascii="Times New Roman" w:hAnsi="Times New Roman"/>
+                <w:sz w:val="28"/>
+              </w:rPr>
+              <w:t>Список бази, вербовка, екіпіровка</w:t>
+            </w:r>
+          </w:p>
+        </w:tc>
+        <w:tc>
+          <w:tcPr>
+            <w:tcW w:type="dxa" w:w="3213"/>
+          </w:tcPr>
+          <w:p>
+            <w:r>
+              <w:rPr>
+                <w:rFonts w:ascii="Times New Roman" w:hAnsi="Times New Roman"/>
+                <w:sz w:val="28"/>
+              </w:rPr>
+              <w:t>Команди db / recruit / fetch + звичайний add</w:t>
+            </w:r>
+          </w:p>
+        </w:tc>
+        <w:tc>
+          <w:tcPr>
+            <w:tcW w:type="dxa" w:w="3213"/>
+          </w:tcPr>
+          <w:p>
+            <w:r>
+              <w:rPr>
+                <w:rFonts w:ascii="Times New Roman" w:hAnsi="Times New Roman"/>
+                <w:sz w:val="28"/>
+              </w:rPr>
+              <w:t>demo/recruit-demo.txt</w:t>
+            </w:r>
+          </w:p>
+        </w:tc>
+      </w:tr>
+      <w:tr>
+        <w:tc>
+          <w:tcPr>
+            <w:tcW w:type="dxa" w:w="3213"/>
+          </w:tcPr>
+          <w:p>
+            <w:r>
+              <w:rPr>
+                <w:rFonts w:ascii="Times New Roman" w:hAnsi="Times New Roman"/>
+                <w:sz w:val="28"/>
+              </w:rPr>
+              <w:t>Стан персонажа в консолі</w:t>
+            </w:r>
+          </w:p>
+        </w:tc>
+        <w:tc>
+          <w:tcPr>
+            <w:tcW w:type="dxa" w:w="3213"/>
+          </w:tcPr>
+          <w:p>
+            <w:r>
+              <w:rPr>
+                <w:rFonts w:ascii="Times New Roman" w:hAnsi="Times New Roman"/>
+                <w:sz w:val="28"/>
+              </w:rPr>
+              <w:t>Лист + повний стан (приклад вище)</w:t>
+            </w:r>
+          </w:p>
+        </w:tc>
+        <w:tc>
+          <w:tcPr>
+            <w:tcW w:type="dxa" w:w="3213"/>
+          </w:tcPr>
+          <w:p>
+            <w:r>
+              <w:rPr>
+                <w:rFonts w:ascii="Times New Roman" w:hAnsi="Times New Roman"/>
+                <w:sz w:val="28"/>
+              </w:rPr>
+              <w:t>show, ls char --id</w:t>
+            </w:r>
+          </w:p>
+        </w:tc>
+      </w:tr>
+      <w:tr>
+        <w:tc>
+          <w:tcPr>
+            <w:tcW w:type="dxa" w:w="3213"/>
+          </w:tcPr>
+          <w:p>
+            <w:r>
+              <w:rPr>
+                <w:rFonts w:ascii="Times New Roman" w:hAnsi="Times New Roman"/>
+                <w:sz w:val="28"/>
+              </w:rPr>
+              <w:t>Тести коду</w:t>
+            </w:r>
+          </w:p>
+        </w:tc>
+        <w:tc>
+          <w:tcPr>
+            <w:tcW w:type="dxa" w:w="3213"/>
+          </w:tcPr>
+          <w:p>
+            <w:r>
+              <w:rPr>
+                <w:rFonts w:ascii="Times New Roman" w:hAnsi="Times New Roman"/>
+                <w:sz w:val="28"/>
+              </w:rPr>
+              <w:t>28 нових тестів WebApi-шляху, всього 140</w:t>
+            </w:r>
+          </w:p>
+        </w:tc>
+        <w:tc>
+          <w:tcPr>
+            <w:tcW w:type="dxa" w:w="3213"/>
+          </w:tcPr>
+          <w:p>
+            <w:r>
+              <w:rPr>
+                <w:rFonts w:ascii="Times New Roman" w:hAnsi="Times New Roman"/>
+                <w:sz w:val="28"/>
+              </w:rPr>
+              <w:t>src/Tests.Infra, src/Tests.Cli, dotnet test</w:t>
+            </w:r>
+          </w:p>
+        </w:tc>
+      </w:tr>
+    </w:tbl>
     <w:p>
       <w:pPr>
         <w:pStyle w:val="Heading1"/>

</xml_diff>